<commit_message>
Add OpenHighways project to CV; tighten home page personal statement
</commit_message>
<xml_diff>
--- a/cv/James Dillon CV.docx
+++ b/cv/James Dillon CV.docx
@@ -1145,6 +1145,146 @@
           <w:color w:val="1B365D"/>
           <w:sz w:val="21"/>
         </w:rPr>
+        <w:t>OpenHighways — Live UK Traffic Camera Map</w:t>
+      </w:r>
+      <w:r>
+        <w:rPr>
+          <w:rFonts w:ascii="Calibri" w:hAnsi="Calibri"/>
+          <w:b w:val="0"/>
+          <w:i w:val="0"/>
+          <w:color w:val="A0A8B4"/>
+          <w:sz w:val="20"/>
+        </w:rPr>
+        <w:t xml:space="preserve">  |  </w:t>
+      </w:r>
+      <w:r>
+        <w:rPr>
+          <w:rFonts w:ascii="Calibri" w:hAnsi="Calibri"/>
+          <w:b w:val="0"/>
+          <w:i w:val="0"/>
+          <w:color w:val="1A1A1A"/>
+          <w:sz w:val="20"/>
+        </w:rPr>
+        <w:t>SvelteKit, Leaflet, Docker</w:t>
+      </w:r>
+      <w:r>
+        <w:tab/>
+      </w:r>
+      <w:r>
+        <w:rPr>
+          <w:rFonts w:ascii="Calibri" w:hAnsi="Calibri"/>
+          <w:b w:val="0"/>
+          <w:i/>
+          <w:color w:val="555B66"/>
+          <w:sz w:val="18"/>
+        </w:rPr>
+        <w:t>2026</w:t>
+      </w:r>
+    </w:p>
+    <w:p>
+      <w:pPr>
+        <w:tabs>
+          <w:tab w:pos="245" w:val="left"/>
+        </w:tabs>
+        <w:spacing w:before="0" w:after="68" w:line="245" w:lineRule="auto"/>
+        <w:ind w:left="245" w:hanging="245"/>
+      </w:pPr>
+      <w:r>
+        <w:rPr>
+          <w:rFonts w:ascii="Calibri" w:hAnsi="Calibri"/>
+          <w:b/>
+          <w:color w:val="1B365D"/>
+          <w:sz w:val="20"/>
+        </w:rPr>
+        <w:t>•</w:t>
+        <w:tab/>
+      </w:r>
+      <w:r>
+        <w:rPr>
+          <w:rFonts w:ascii="Calibri" w:hAnsi="Calibri"/>
+          <w:b/>
+          <w:i w:val="0"/>
+          <w:color w:val="1A1A1A"/>
+          <w:sz w:val="20"/>
+        </w:rPr>
+        <w:t xml:space="preserve">openhighways.uk — </w:t>
+      </w:r>
+      <w:r>
+        <w:rPr>
+          <w:rFonts w:ascii="Calibri" w:hAnsi="Calibri"/>
+          <w:b w:val="0"/>
+          <w:i w:val="0"/>
+          <w:color w:val="1A1A1A"/>
+          <w:sz w:val="20"/>
+        </w:rPr>
+        <w:t xml:space="preserve">a free, live map of UK traffic cameras, pulling feeds from National Highways, TfL, Traffic Scotland, Traffic Wales and TrafficWatchNI into one place, with on-device vehicle counting for busy roads. Code on GitHub at </w:t>
+      </w:r>
+      <w:hyperlink r:id="rId15">
+        <w:r>
+          <w:rPr>
+            <w:rFonts w:ascii="Calibri" w:hAnsi="Calibri"/>
+            <w:color w:val="1A1A1A"/>
+            <w:sz w:val="20"/>
+          </w:rPr>
+          <w:t xml:space="preserve">JamesDillonDev/openhighways</w:t>
+        </w:r>
+      </w:hyperlink>
+      <w:r>
+        <w:rPr>
+          <w:rFonts w:ascii="Calibri" w:hAnsi="Calibri"/>
+          <w:b w:val="0"/>
+          <w:i w:val="0"/>
+          <w:color w:val="1A1A1A"/>
+          <w:sz w:val="20"/>
+        </w:rPr>
+        <w:t>.</w:t>
+      </w:r>
+    </w:p>
+    <w:p>
+      <w:pPr>
+        <w:tabs>
+          <w:tab w:pos="245" w:val="left"/>
+        </w:tabs>
+        <w:spacing w:before="0" w:after="68" w:line="245" w:lineRule="auto"/>
+        <w:ind w:left="245" w:hanging="245"/>
+      </w:pPr>
+      <w:r>
+        <w:rPr>
+          <w:rFonts w:ascii="Calibri" w:hAnsi="Calibri"/>
+          <w:b/>
+          <w:color w:val="1B365D"/>
+          <w:sz w:val="20"/>
+        </w:rPr>
+        <w:t>•</w:t>
+        <w:tab/>
+      </w:r>
+      <w:r>
+        <w:rPr>
+          <w:rFonts w:ascii="Calibri" w:hAnsi="Calibri"/>
+          <w:b w:val="0"/>
+          <w:i w:val="0"/>
+          <w:color w:val="1A1A1A"/>
+          <w:sz w:val="20"/>
+        </w:rPr>
+        <w:t>Self-hosted and deployed the same way as my portfolio site, with a Docker image rebuilt and redeployed automatically on every push.</w:t>
+      </w:r>
+    </w:p>
+    <w:p>
+      <w:pPr>
+        <w:tabs>
+          <w:tab w:pos="10613" w:val="right"/>
+        </w:tabs>
+        <w:spacing w:before="140" w:after="50" w:line="240" w:lineRule="auto"/>
+        <w:keepNext/>
+      </w:pPr>
+      <w:r>
+        <w:rPr>
+          <w:rFonts w:ascii="Calibri" w:hAnsi="Calibri"/>
+          <w:b/>
+          <w:i w:val="0"/>
+          <w:color w:val="1B365D"/>
+          <w:sz w:val="21"/>
+        </w:rPr>
         <w:t>jamesdillon.uk — Portfolio Website</w:t>
       </w:r>
       <w:r>

</xml_diff>

<commit_message>
Update CV: OpenHighways is React, rewrite profile, add LoRa, reword Design skill
Co-Authored-By: Claude Sonnet 5.5 <noreply@anthropic.com>
</commit_message>
<xml_diff>
--- a/cv/James Dillon CV.docx
+++ b/cv/James Dillon CV.docx
@@ -319,7 +319,7 @@
           <w:color w:val="1A1A1A"/>
           <w:sz w:val="20"/>
         </w:rPr>
-        <w:t>Sixth form student studying Maths, Computer Science and Product Design, looking for a software or engineering apprenticeship. I have worked part-time as a junior software engineer at Janus Technology since July 2025, building features that went out to real customers, and spent a placement at MBDA working on a Raspberry Pi guided missile project. Outside of school I build things end to end, from a self-hosted website and home server to 3D-printed electronics projects. I am also a Sergeant in the Air Cadets, so I am used to teaching, organising and being responsible for other people.</w:t>
+        <w:t>I’m a Year 13 student studying Maths, Computer Science and Product Design, with a strong interest in software and engineering. I particularly enjoy combining software with hardware, which I’ve explored through projects including a smart home and an automated pet feeder, alongside experience at Janus Technology and MBDA. Aviation is also a big interest of mine, both as a hobby and through the RAF Air Cadets, where I’m now a Sergeant. I’m looking for a software or engineering apprenticeship where I can build on these interests while gaining practical experience in industry.</w:t>
       </w:r>
     </w:p>
     <w:p>
@@ -402,7 +402,7 @@
           <w:color w:val="1A1A1A"/>
           <w:sz w:val="20"/>
         </w:rPr>
-        <w:t>SvelteKit, HTML/CSS; building web apps and plugins to a brief</w:t>
+        <w:t>React, SvelteKit, HTML/CSS; building web apps and plugins to a brief</w:t>
       </w:r>
     </w:p>
     <w:p>
@@ -530,7 +530,7 @@
           <w:color w:val="1A1A1A"/>
           <w:sz w:val="20"/>
         </w:rPr>
-        <w:t>Raspberry Pi, Zigbee, sensors and smart devices, wiring and low-voltage installation, hardware integration, testing and fault-finding</w:t>
+        <w:t>Raspberry Pi, Zigbee, LoRa, sensors and smart devices, wiring and low-voltage installation, hardware integration, testing and fault-finding</w:t>
       </w:r>
     </w:p>
     <w:p>
@@ -562,7 +562,7 @@
           <w:color w:val="1A1A1A"/>
           <w:sz w:val="20"/>
         </w:rPr>
-        <w:t>Product and concept design, CAD, 3D printing, electronics, prototyping and iterating from a brief (A-Level Product Design, GCSE DT grade 9)</w:t>
+        <w:t>Taking a product from brief to working prototype: research, sketching and concept development, CAD modelling, 3D printing and electronics, then testing and iterating (A-Level Product Design, GCSE DT grade 9, EPQ A*)</w:t>
       </w:r>
     </w:p>
     <w:p>
@@ -1165,7 +1165,7 @@
           <w:color w:val="1A1A1A"/>
           <w:sz w:val="20"/>
         </w:rPr>
-        <w:t>SvelteKit, Leaflet, Docker</w:t>
+        <w:t>React, Leaflet, Docker</w:t>
       </w:r>
       <w:r>
         <w:tab/>

</xml_diff>

<commit_message>
CV: replace version control with leadership, communication and teamwork skills; shorten Design
Co-Authored-By: Claude Sonnet 5.5 <noreply@anthropic.com>
</commit_message>
<xml_diff>
--- a/cv/James Dillon CV.docx
+++ b/cv/James Dillon CV.docx
@@ -453,38 +453,6 @@
           <w:color w:val="1B365D"/>
           <w:sz w:val="20"/>
         </w:rPr>
-        <w:t>Version control</w:t>
-      </w:r>
-      <w:r>
-        <w:tab/>
-      </w:r>
-      <w:r>
-        <w:rPr>
-          <w:rFonts w:ascii="Calibri" w:hAnsi="Calibri"/>
-          <w:b w:val="0"/>
-          <w:i w:val="0"/>
-          <w:color w:val="1A1A1A"/>
-          <w:sz w:val="20"/>
-        </w:rPr>
-        <w:t>Git, GitHub, self-hosted GitLab</w:t>
-      </w:r>
-    </w:p>
-    <w:p>
-      <w:pPr>
-        <w:tabs>
-          <w:tab w:pos="1872" w:val="left"/>
-        </w:tabs>
-        <w:spacing w:before="0" w:after="72" w:line="245" w:lineRule="auto"/>
-        <w:ind w:left="1872" w:hanging="1872"/>
-      </w:pPr>
-      <w:r>
-        <w:rPr>
-          <w:rFonts w:ascii="Calibri" w:hAnsi="Calibri"/>
-          <w:b/>
-          <w:i w:val="0"/>
-          <w:color w:val="1B365D"/>
-          <w:sz w:val="20"/>
-        </w:rPr>
         <w:t>AI tooling</w:t>
       </w:r>
       <w:r>
@@ -562,7 +530,103 @@
           <w:color w:val="1A1A1A"/>
           <w:sz w:val="20"/>
         </w:rPr>
-        <w:t>Taking a product from brief to working prototype: research, sketching and concept development, CAD modelling, 3D printing and electronics, then testing and iterating (A-Level Product Design, GCSE DT grade 9, EPQ A*)</w:t>
+        <w:t>Product design from brief to prototype: CAD, 3D printing and electronics (A-Level Product Design, GCSE DT grade 9)</w:t>
+      </w:r>
+    </w:p>
+    <w:p>
+      <w:pPr>
+        <w:tabs>
+          <w:tab w:pos="1872" w:val="left"/>
+        </w:tabs>
+        <w:spacing w:before="0" w:after="72" w:line="245" w:lineRule="auto"/>
+        <w:ind w:left="1872" w:hanging="1872"/>
+      </w:pPr>
+      <w:r>
+        <w:rPr>
+          <w:rFonts w:ascii="Calibri" w:hAnsi="Calibri"/>
+          <w:b/>
+          <w:i w:val="0"/>
+          <w:color w:val="1B365D"/>
+          <w:sz w:val="20"/>
+        </w:rPr>
+        <w:t>Leadership</w:t>
+      </w:r>
+      <w:r>
+        <w:tab/>
+      </w:r>
+      <w:r>
+        <w:rPr>
+          <w:rFonts w:ascii="Calibri" w:hAnsi="Calibri"/>
+          <w:b w:val="0"/>
+          <w:i w:val="0"/>
+          <w:color w:val="1A1A1A"/>
+          <w:sz w:val="20"/>
+        </w:rPr>
+        <w:t>Air Cadets Sergeant responsible for junior cadets; Scouts Young Leader</w:t>
+      </w:r>
+    </w:p>
+    <w:p>
+      <w:pPr>
+        <w:tabs>
+          <w:tab w:pos="1872" w:val="left"/>
+        </w:tabs>
+        <w:spacing w:before="0" w:after="72" w:line="245" w:lineRule="auto"/>
+        <w:ind w:left="1872" w:hanging="1872"/>
+      </w:pPr>
+      <w:r>
+        <w:rPr>
+          <w:rFonts w:ascii="Calibri" w:hAnsi="Calibri"/>
+          <w:b/>
+          <w:i w:val="0"/>
+          <w:color w:val="1B365D"/>
+          <w:sz w:val="20"/>
+        </w:rPr>
+        <w:t>Communication</w:t>
+      </w:r>
+      <w:r>
+        <w:tab/>
+      </w:r>
+      <w:r>
+        <w:rPr>
+          <w:rFonts w:ascii="Calibri" w:hAnsi="Calibri"/>
+          <w:b w:val="0"/>
+          <w:i w:val="0"/>
+          <w:color w:val="1A1A1A"/>
+          <w:sz w:val="20"/>
+        </w:rPr>
+        <w:t>Plan and deliver lessons to groups of 10–20; Instructor First Aid</w:t>
+      </w:r>
+    </w:p>
+    <w:p>
+      <w:pPr>
+        <w:tabs>
+          <w:tab w:pos="1872" w:val="left"/>
+        </w:tabs>
+        <w:spacing w:before="0" w:after="72" w:line="245" w:lineRule="auto"/>
+        <w:ind w:left="1872" w:hanging="1872"/>
+      </w:pPr>
+      <w:r>
+        <w:rPr>
+          <w:rFonts w:ascii="Calibri" w:hAnsi="Calibri"/>
+          <w:b/>
+          <w:i w:val="0"/>
+          <w:color w:val="1B365D"/>
+          <w:sz w:val="20"/>
+        </w:rPr>
+        <w:t>Teamwork</w:t>
+      </w:r>
+      <w:r>
+        <w:tab/>
+      </w:r>
+      <w:r>
+        <w:rPr>
+          <w:rFonts w:ascii="Calibri" w:hAnsi="Calibri"/>
+          <w:b w:val="0"/>
+          <w:i w:val="0"/>
+          <w:color w:val="1A1A1A"/>
+          <w:sz w:val="20"/>
+        </w:rPr>
+        <w:t>Team project on work experience at MBDA; part-time at Janus Technology; volunteer teams at events</w:t>
       </w:r>
     </w:p>
     <w:p>

</xml_diff>

<commit_message>
CV: soft skills first, move Leadership & Volunteering before Projects; add cover letter template
Co-Authored-By: Claude Sonnet 5.5 <noreply@anthropic.com>
</commit_message>
<xml_diff>
--- a/cv/James Dillon CV.docx
+++ b/cv/James Dillon CV.docx
@@ -357,6 +357,102 @@
           <w:color w:val="1B365D"/>
           <w:sz w:val="20"/>
         </w:rPr>
+        <w:t>Leadership</w:t>
+      </w:r>
+      <w:r>
+        <w:tab/>
+      </w:r>
+      <w:r>
+        <w:rPr>
+          <w:rFonts w:ascii="Calibri" w:hAnsi="Calibri"/>
+          <w:b w:val="0"/>
+          <w:i w:val="0"/>
+          <w:color w:val="1A1A1A"/>
+          <w:sz w:val="20"/>
+        </w:rPr>
+        <w:t>Air Cadets Sergeant responsible for junior cadets; Scouts Young Leader</w:t>
+      </w:r>
+    </w:p>
+    <w:p>
+      <w:pPr>
+        <w:tabs>
+          <w:tab w:pos="1872" w:val="left"/>
+        </w:tabs>
+        <w:spacing w:before="0" w:after="72" w:line="245" w:lineRule="auto"/>
+        <w:ind w:left="1872" w:hanging="1872"/>
+      </w:pPr>
+      <w:r>
+        <w:rPr>
+          <w:rFonts w:ascii="Calibri" w:hAnsi="Calibri"/>
+          <w:b/>
+          <w:i w:val="0"/>
+          <w:color w:val="1B365D"/>
+          <w:sz w:val="20"/>
+        </w:rPr>
+        <w:t>Communication</w:t>
+      </w:r>
+      <w:r>
+        <w:tab/>
+      </w:r>
+      <w:r>
+        <w:rPr>
+          <w:rFonts w:ascii="Calibri" w:hAnsi="Calibri"/>
+          <w:b w:val="0"/>
+          <w:i w:val="0"/>
+          <w:color w:val="1A1A1A"/>
+          <w:sz w:val="20"/>
+        </w:rPr>
+        <w:t>Plan and deliver lessons to groups of 10–20; Instructor First Aid</w:t>
+      </w:r>
+    </w:p>
+    <w:p>
+      <w:pPr>
+        <w:tabs>
+          <w:tab w:pos="1872" w:val="left"/>
+        </w:tabs>
+        <w:spacing w:before="0" w:after="72" w:line="245" w:lineRule="auto"/>
+        <w:ind w:left="1872" w:hanging="1872"/>
+      </w:pPr>
+      <w:r>
+        <w:rPr>
+          <w:rFonts w:ascii="Calibri" w:hAnsi="Calibri"/>
+          <w:b/>
+          <w:i w:val="0"/>
+          <w:color w:val="1B365D"/>
+          <w:sz w:val="20"/>
+        </w:rPr>
+        <w:t>Teamwork</w:t>
+      </w:r>
+      <w:r>
+        <w:tab/>
+      </w:r>
+      <w:r>
+        <w:rPr>
+          <w:rFonts w:ascii="Calibri" w:hAnsi="Calibri"/>
+          <w:b w:val="0"/>
+          <w:i w:val="0"/>
+          <w:color w:val="1A1A1A"/>
+          <w:sz w:val="20"/>
+        </w:rPr>
+        <w:t>Team project on work experience at MBDA; part-time at Janus Technology; volunteer teams at events</w:t>
+      </w:r>
+    </w:p>
+    <w:p>
+      <w:pPr>
+        <w:tabs>
+          <w:tab w:pos="1872" w:val="left"/>
+        </w:tabs>
+        <w:spacing w:before="0" w:after="72" w:line="245" w:lineRule="auto"/>
+        <w:ind w:left="1872" w:hanging="1872"/>
+      </w:pPr>
+      <w:r>
+        <w:rPr>
+          <w:rFonts w:ascii="Calibri" w:hAnsi="Calibri"/>
+          <w:b/>
+          <w:i w:val="0"/>
+          <w:color w:val="1B365D"/>
+          <w:sz w:val="20"/>
+        </w:rPr>
         <w:t>Languages</w:t>
       </w:r>
       <w:r>
@@ -531,102 +627,6 @@
           <w:sz w:val="20"/>
         </w:rPr>
         <w:t>Product design from brief to prototype: CAD, 3D printing and electronics (A-Level Product Design, GCSE DT grade 9)</w:t>
-      </w:r>
-    </w:p>
-    <w:p>
-      <w:pPr>
-        <w:tabs>
-          <w:tab w:pos="1872" w:val="left"/>
-        </w:tabs>
-        <w:spacing w:before="0" w:after="72" w:line="245" w:lineRule="auto"/>
-        <w:ind w:left="1872" w:hanging="1872"/>
-      </w:pPr>
-      <w:r>
-        <w:rPr>
-          <w:rFonts w:ascii="Calibri" w:hAnsi="Calibri"/>
-          <w:b/>
-          <w:i w:val="0"/>
-          <w:color w:val="1B365D"/>
-          <w:sz w:val="20"/>
-        </w:rPr>
-        <w:t>Leadership</w:t>
-      </w:r>
-      <w:r>
-        <w:tab/>
-      </w:r>
-      <w:r>
-        <w:rPr>
-          <w:rFonts w:ascii="Calibri" w:hAnsi="Calibri"/>
-          <w:b w:val="0"/>
-          <w:i w:val="0"/>
-          <w:color w:val="1A1A1A"/>
-          <w:sz w:val="20"/>
-        </w:rPr>
-        <w:t>Air Cadets Sergeant responsible for junior cadets; Scouts Young Leader</w:t>
-      </w:r>
-    </w:p>
-    <w:p>
-      <w:pPr>
-        <w:tabs>
-          <w:tab w:pos="1872" w:val="left"/>
-        </w:tabs>
-        <w:spacing w:before="0" w:after="72" w:line="245" w:lineRule="auto"/>
-        <w:ind w:left="1872" w:hanging="1872"/>
-      </w:pPr>
-      <w:r>
-        <w:rPr>
-          <w:rFonts w:ascii="Calibri" w:hAnsi="Calibri"/>
-          <w:b/>
-          <w:i w:val="0"/>
-          <w:color w:val="1B365D"/>
-          <w:sz w:val="20"/>
-        </w:rPr>
-        <w:t>Communication</w:t>
-      </w:r>
-      <w:r>
-        <w:tab/>
-      </w:r>
-      <w:r>
-        <w:rPr>
-          <w:rFonts w:ascii="Calibri" w:hAnsi="Calibri"/>
-          <w:b w:val="0"/>
-          <w:i w:val="0"/>
-          <w:color w:val="1A1A1A"/>
-          <w:sz w:val="20"/>
-        </w:rPr>
-        <w:t>Plan and deliver lessons to groups of 10–20; Instructor First Aid</w:t>
-      </w:r>
-    </w:p>
-    <w:p>
-      <w:pPr>
-        <w:tabs>
-          <w:tab w:pos="1872" w:val="left"/>
-        </w:tabs>
-        <w:spacing w:before="0" w:after="72" w:line="245" w:lineRule="auto"/>
-        <w:ind w:left="1872" w:hanging="1872"/>
-      </w:pPr>
-      <w:r>
-        <w:rPr>
-          <w:rFonts w:ascii="Calibri" w:hAnsi="Calibri"/>
-          <w:b/>
-          <w:i w:val="0"/>
-          <w:color w:val="1B365D"/>
-          <w:sz w:val="20"/>
-        </w:rPr>
-        <w:t>Teamwork</w:t>
-      </w:r>
-      <w:r>
-        <w:tab/>
-      </w:r>
-      <w:r>
-        <w:rPr>
-          <w:rFonts w:ascii="Calibri" w:hAnsi="Calibri"/>
-          <w:b w:val="0"/>
-          <w:i w:val="0"/>
-          <w:color w:val="1A1A1A"/>
-          <w:sz w:val="20"/>
-        </w:rPr>
-        <w:t>Team project on work experience at MBDA; part-time at Janus Technology; volunteer teams at events</w:t>
       </w:r>
     </w:p>
     <w:p>
@@ -1190,6 +1190,413 @@
           <w:color w:val="1B365D"/>
           <w:sz w:val="22"/>
         </w:rPr>
+        <w:t>LEADERSHIP &amp; VOLUNTEERING</w:t>
+      </w:r>
+    </w:p>
+    <w:p>
+      <w:pPr>
+        <w:tabs>
+          <w:tab w:pos="10613" w:val="right"/>
+        </w:tabs>
+        <w:spacing w:before="140" w:after="50" w:line="240" w:lineRule="auto"/>
+        <w:keepNext/>
+      </w:pPr>
+      <w:r>
+        <w:rPr>
+          <w:rFonts w:ascii="Calibri" w:hAnsi="Calibri"/>
+          <w:b/>
+          <w:i w:val="0"/>
+          <w:color w:val="1B365D"/>
+          <w:sz w:val="21"/>
+        </w:rPr>
+        <w:t>RAF Air Cadets, 248 Squadron</w:t>
+      </w:r>
+      <w:r>
+        <w:rPr>
+          <w:rFonts w:ascii="Calibri" w:hAnsi="Calibri"/>
+          <w:b w:val="0"/>
+          <w:i w:val="0"/>
+          <w:color w:val="A0A8B4"/>
+          <w:sz w:val="20"/>
+        </w:rPr>
+        <w:t xml:space="preserve">  |  </w:t>
+      </w:r>
+      <w:r>
+        <w:rPr>
+          <w:rFonts w:ascii="Calibri" w:hAnsi="Calibri"/>
+          <w:b w:val="0"/>
+          <w:i w:val="0"/>
+          <w:color w:val="1A1A1A"/>
+          <w:sz w:val="20"/>
+        </w:rPr>
+        <w:t>Sergeant</w:t>
+      </w:r>
+      <w:r>
+        <w:tab/>
+      </w:r>
+      <w:r>
+        <w:rPr>
+          <w:rFonts w:ascii="Calibri" w:hAnsi="Calibri"/>
+          <w:b w:val="0"/>
+          <w:i/>
+          <w:color w:val="555B66"/>
+          <w:sz w:val="18"/>
+        </w:rPr>
+        <w:t>2022 – present</w:t>
+      </w:r>
+    </w:p>
+    <w:p>
+      <w:pPr>
+        <w:tabs>
+          <w:tab w:pos="245" w:val="left"/>
+        </w:tabs>
+        <w:spacing w:before="0" w:after="68" w:line="245" w:lineRule="auto"/>
+        <w:ind w:left="245" w:hanging="245"/>
+      </w:pPr>
+      <w:r>
+        <w:rPr>
+          <w:rFonts w:ascii="Calibri" w:hAnsi="Calibri"/>
+          <w:b/>
+          <w:color w:val="1B365D"/>
+          <w:sz w:val="20"/>
+        </w:rPr>
+        <w:t>•</w:t>
+        <w:tab/>
+      </w:r>
+      <w:r>
+        <w:rPr>
+          <w:rFonts w:ascii="Calibri" w:hAnsi="Calibri"/>
+          <w:b w:val="0"/>
+          <w:i w:val="0"/>
+          <w:color w:val="1A1A1A"/>
+          <w:sz w:val="20"/>
+        </w:rPr>
+        <w:t>Promoted through four ranks to Sergeant, responsible for the training and welfare of junior cadets on weekly parade nights.</w:t>
+      </w:r>
+    </w:p>
+    <w:p>
+      <w:pPr>
+        <w:tabs>
+          <w:tab w:pos="245" w:val="left"/>
+        </w:tabs>
+        <w:spacing w:before="0" w:after="68" w:line="245" w:lineRule="auto"/>
+        <w:ind w:left="245" w:hanging="245"/>
+      </w:pPr>
+      <w:r>
+        <w:rPr>
+          <w:rFonts w:ascii="Calibri" w:hAnsi="Calibri"/>
+          <w:b/>
+          <w:color w:val="1B365D"/>
+          <w:sz w:val="20"/>
+        </w:rPr>
+        <w:t>•</w:t>
+        <w:tab/>
+      </w:r>
+      <w:r>
+        <w:rPr>
+          <w:rFonts w:ascii="Calibri" w:hAnsi="Calibri"/>
+          <w:b w:val="0"/>
+          <w:i w:val="0"/>
+          <w:color w:val="1A1A1A"/>
+          <w:sz w:val="20"/>
+        </w:rPr>
+        <w:t>Methods of Instruction qualified, so I plan and deliver lessons to groups of 10–20 and assess cadets afterwards. Also hold the Silver Leadership award.</w:t>
+      </w:r>
+    </w:p>
+    <w:p>
+      <w:pPr>
+        <w:tabs>
+          <w:tab w:pos="245" w:val="left"/>
+        </w:tabs>
+        <w:spacing w:before="0" w:after="68" w:line="245" w:lineRule="auto"/>
+        <w:ind w:left="245" w:hanging="245"/>
+      </w:pPr>
+      <w:r>
+        <w:rPr>
+          <w:rFonts w:ascii="Calibri" w:hAnsi="Calibri"/>
+          <w:b/>
+          <w:color w:val="1B365D"/>
+          <w:sz w:val="20"/>
+        </w:rPr>
+        <w:t>•</w:t>
+        <w:tab/>
+      </w:r>
+      <w:r>
+        <w:rPr>
+          <w:rFonts w:ascii="Calibri" w:hAnsi="Calibri"/>
+          <w:b w:val="0"/>
+          <w:i w:val="0"/>
+          <w:color w:val="1A1A1A"/>
+          <w:sz w:val="20"/>
+        </w:rPr>
+        <w:t>Qualified First Aid Instructor (St John Ambulance), able to teach and assess first aid as well as respond to incidents.</w:t>
+      </w:r>
+    </w:p>
+    <w:p>
+      <w:pPr>
+        <w:tabs>
+          <w:tab w:pos="245" w:val="left"/>
+        </w:tabs>
+        <w:spacing w:before="0" w:after="68" w:line="245" w:lineRule="auto"/>
+        <w:ind w:left="245" w:hanging="245"/>
+      </w:pPr>
+      <w:r>
+        <w:rPr>
+          <w:rFonts w:ascii="Calibri" w:hAnsi="Calibri"/>
+          <w:b/>
+          <w:color w:val="1B365D"/>
+          <w:sz w:val="20"/>
+        </w:rPr>
+        <w:t>•</w:t>
+        <w:tab/>
+      </w:r>
+      <w:r>
+        <w:rPr>
+          <w:rFonts w:ascii="Calibri" w:hAnsi="Calibri"/>
+          <w:b w:val="0"/>
+          <w:i w:val="0"/>
+          <w:color w:val="1A1A1A"/>
+          <w:sz w:val="20"/>
+        </w:rPr>
+        <w:t>Represent the squadron at public events such as Remembrance Sunday, and competed in athletics at Wing and Regional level.</w:t>
+      </w:r>
+    </w:p>
+    <w:p>
+      <w:pPr>
+        <w:tabs>
+          <w:tab w:pos="10613" w:val="right"/>
+        </w:tabs>
+        <w:spacing w:before="140" w:after="50" w:line="240" w:lineRule="auto"/>
+        <w:keepNext/>
+      </w:pPr>
+      <w:r>
+        <w:rPr>
+          <w:rFonts w:ascii="Calibri" w:hAnsi="Calibri"/>
+          <w:b/>
+          <w:i w:val="0"/>
+          <w:color w:val="1B365D"/>
+          <w:sz w:val="21"/>
+        </w:rPr>
+        <w:t>Scouts and Explorers</w:t>
+      </w:r>
+      <w:r>
+        <w:rPr>
+          <w:rFonts w:ascii="Calibri" w:hAnsi="Calibri"/>
+          <w:b w:val="0"/>
+          <w:i w:val="0"/>
+          <w:color w:val="A0A8B4"/>
+          <w:sz w:val="20"/>
+        </w:rPr>
+        <w:t xml:space="preserve">  |  </w:t>
+      </w:r>
+      <w:r>
+        <w:rPr>
+          <w:rFonts w:ascii="Calibri" w:hAnsi="Calibri"/>
+          <w:b w:val="0"/>
+          <w:i w:val="0"/>
+          <w:color w:val="1A1A1A"/>
+          <w:sz w:val="20"/>
+        </w:rPr>
+        <w:t>Young Leader</w:t>
+      </w:r>
+      <w:r>
+        <w:tab/>
+      </w:r>
+      <w:r>
+        <w:rPr>
+          <w:rFonts w:ascii="Calibri" w:hAnsi="Calibri"/>
+          <w:b w:val="0"/>
+          <w:i/>
+          <w:color w:val="555B66"/>
+          <w:sz w:val="18"/>
+        </w:rPr>
+        <w:t>2014 – present</w:t>
+      </w:r>
+    </w:p>
+    <w:p>
+      <w:pPr>
+        <w:tabs>
+          <w:tab w:pos="245" w:val="left"/>
+        </w:tabs>
+        <w:spacing w:before="0" w:after="68" w:line="245" w:lineRule="auto"/>
+        <w:ind w:left="245" w:hanging="245"/>
+      </w:pPr>
+      <w:r>
+        <w:rPr>
+          <w:rFonts w:ascii="Calibri" w:hAnsi="Calibri"/>
+          <w:b/>
+          <w:color w:val="1B365D"/>
+          <w:sz w:val="20"/>
+        </w:rPr>
+        <w:t>•</w:t>
+        <w:tab/>
+      </w:r>
+      <w:r>
+        <w:rPr>
+          <w:rFonts w:ascii="Calibri" w:hAnsi="Calibri"/>
+          <w:b w:val="0"/>
+          <w:i w:val="0"/>
+          <w:color w:val="1A1A1A"/>
+          <w:sz w:val="20"/>
+        </w:rPr>
+        <w:t>Help run weekly meetings at my old Scout group, planning activities, keeping sessions on track and supporting the leaders.</w:t>
+      </w:r>
+    </w:p>
+    <w:p>
+      <w:pPr>
+        <w:tabs>
+          <w:tab w:pos="245" w:val="left"/>
+        </w:tabs>
+        <w:spacing w:before="0" w:after="68" w:line="245" w:lineRule="auto"/>
+        <w:ind w:left="245" w:hanging="245"/>
+      </w:pPr>
+      <w:r>
+        <w:rPr>
+          <w:rFonts w:ascii="Calibri" w:hAnsi="Calibri"/>
+          <w:b/>
+          <w:color w:val="1B365D"/>
+          <w:sz w:val="20"/>
+        </w:rPr>
+        <w:t>•</w:t>
+        <w:tab/>
+      </w:r>
+      <w:r>
+        <w:rPr>
+          <w:rFonts w:ascii="Calibri" w:hAnsi="Calibri"/>
+          <w:b w:val="0"/>
+          <w:i w:val="0"/>
+          <w:color w:val="1A1A1A"/>
+          <w:sz w:val="20"/>
+        </w:rPr>
+        <w:t>Help organise weekend camps and residentials: sorting equipment, giving safety briefings and running outdoor activities.</w:t>
+      </w:r>
+    </w:p>
+    <w:p>
+      <w:pPr>
+        <w:tabs>
+          <w:tab w:pos="245" w:val="left"/>
+        </w:tabs>
+        <w:spacing w:before="0" w:after="68" w:line="245" w:lineRule="auto"/>
+        <w:ind w:left="245" w:hanging="245"/>
+      </w:pPr>
+      <w:r>
+        <w:rPr>
+          <w:rFonts w:ascii="Calibri" w:hAnsi="Calibri"/>
+          <w:b/>
+          <w:color w:val="1B365D"/>
+          <w:sz w:val="20"/>
+        </w:rPr>
+        <w:t>•</w:t>
+        <w:tab/>
+      </w:r>
+      <w:r>
+        <w:rPr>
+          <w:rFonts w:ascii="Calibri" w:hAnsi="Calibri"/>
+          <w:b w:val="0"/>
+          <w:i w:val="0"/>
+          <w:color w:val="1A1A1A"/>
+          <w:sz w:val="20"/>
+        </w:rPr>
+        <w:t>Volunteer on the BBQ and bar at Balstock and the Baldock Beer Festival, serving 100+ members of the public, handling cash and keeping a busy food station clean and safe.</w:t>
+      </w:r>
+    </w:p>
+    <w:p>
+      <w:pPr>
+        <w:tabs>
+          <w:tab w:pos="10613" w:val="right"/>
+        </w:tabs>
+        <w:spacing w:before="140" w:after="50" w:line="240" w:lineRule="auto"/>
+        <w:keepNext/>
+      </w:pPr>
+      <w:r>
+        <w:rPr>
+          <w:rFonts w:ascii="Calibri" w:hAnsi="Calibri"/>
+          <w:b/>
+          <w:i w:val="0"/>
+          <w:color w:val="1B365D"/>
+          <w:sz w:val="21"/>
+        </w:rPr>
+        <w:t>Duke of Edinburgh’s Award</w:t>
+      </w:r>
+      <w:r>
+        <w:rPr>
+          <w:rFonts w:ascii="Calibri" w:hAnsi="Calibri"/>
+          <w:b w:val="0"/>
+          <w:i w:val="0"/>
+          <w:color w:val="A0A8B4"/>
+          <w:sz w:val="20"/>
+        </w:rPr>
+        <w:t xml:space="preserve">  |  </w:t>
+      </w:r>
+      <w:r>
+        <w:rPr>
+          <w:rFonts w:ascii="Calibri" w:hAnsi="Calibri"/>
+          <w:b w:val="0"/>
+          <w:i w:val="0"/>
+          <w:color w:val="1A1A1A"/>
+          <w:sz w:val="20"/>
+        </w:rPr>
+        <w:t>Bronze completed, Silver in progress</w:t>
+      </w:r>
+      <w:r>
+        <w:tab/>
+      </w:r>
+      <w:r>
+        <w:rPr>
+          <w:rFonts w:ascii="Calibri" w:hAnsi="Calibri"/>
+          <w:b w:val="0"/>
+          <w:i/>
+          <w:color w:val="555B66"/>
+          <w:sz w:val="18"/>
+        </w:rPr>
+        <w:t>2022 – present</w:t>
+      </w:r>
+    </w:p>
+    <w:p>
+      <w:pPr>
+        <w:tabs>
+          <w:tab w:pos="245" w:val="left"/>
+        </w:tabs>
+        <w:spacing w:before="0" w:after="68" w:line="245" w:lineRule="auto"/>
+        <w:ind w:left="245" w:hanging="245"/>
+      </w:pPr>
+      <w:r>
+        <w:rPr>
+          <w:rFonts w:ascii="Calibri" w:hAnsi="Calibri"/>
+          <w:b/>
+          <w:color w:val="1B365D"/>
+          <w:sz w:val="20"/>
+        </w:rPr>
+        <w:t>•</w:t>
+        <w:tab/>
+      </w:r>
+      <w:r>
+        <w:rPr>
+          <w:rFonts w:ascii="Calibri" w:hAnsi="Calibri"/>
+          <w:b w:val="0"/>
+          <w:i w:val="0"/>
+          <w:color w:val="1A1A1A"/>
+          <w:sz w:val="20"/>
+        </w:rPr>
+        <w:t>Expeditions in North Yorkshire and the Peak District involving route planning, navigation and teamwork, volunteering in the local community, and a cybersecurity club covering online safety and ethical hacking.</w:t>
+      </w:r>
+    </w:p>
+    <w:p>
+      <w:pPr>
+        <w:spacing w:before="220" w:after="90" w:line="240" w:lineRule="auto"/>
+        <w:pBdr>
+          <w:bottom w:val="single" w:sz="6" w:space="2" w:color="9BA6B8"/>
+        </w:pBdr>
+        <w:keepNext/>
+      </w:pPr>
+      <w:r>
+        <w:rPr>
+          <w:rFonts w:ascii="Calibri" w:hAnsi="Calibri"/>
+          <w:b/>
+          <w:i w:val="0"/>
+          <w:color w:val="1B365D"/>
+          <w:sz w:val="22"/>
+        </w:rPr>
         <w:t>PROJECTS</w:t>
       </w:r>
     </w:p>
@@ -1679,413 +2086,6 @@
           <w:color w:val="1B365D"/>
           <w:sz w:val="22"/>
         </w:rPr>
-        <w:t>LEADERSHIP &amp; VOLUNTEERING</w:t>
-      </w:r>
-    </w:p>
-    <w:p>
-      <w:pPr>
-        <w:tabs>
-          <w:tab w:pos="10613" w:val="right"/>
-        </w:tabs>
-        <w:spacing w:before="140" w:after="50" w:line="240" w:lineRule="auto"/>
-        <w:keepNext/>
-      </w:pPr>
-      <w:r>
-        <w:rPr>
-          <w:rFonts w:ascii="Calibri" w:hAnsi="Calibri"/>
-          <w:b/>
-          <w:i w:val="0"/>
-          <w:color w:val="1B365D"/>
-          <w:sz w:val="21"/>
-        </w:rPr>
-        <w:t>RAF Air Cadets, 248 Squadron</w:t>
-      </w:r>
-      <w:r>
-        <w:rPr>
-          <w:rFonts w:ascii="Calibri" w:hAnsi="Calibri"/>
-          <w:b w:val="0"/>
-          <w:i w:val="0"/>
-          <w:color w:val="A0A8B4"/>
-          <w:sz w:val="20"/>
-        </w:rPr>
-        <w:t xml:space="preserve">  |  </w:t>
-      </w:r>
-      <w:r>
-        <w:rPr>
-          <w:rFonts w:ascii="Calibri" w:hAnsi="Calibri"/>
-          <w:b w:val="0"/>
-          <w:i w:val="0"/>
-          <w:color w:val="1A1A1A"/>
-          <w:sz w:val="20"/>
-        </w:rPr>
-        <w:t>Sergeant</w:t>
-      </w:r>
-      <w:r>
-        <w:tab/>
-      </w:r>
-      <w:r>
-        <w:rPr>
-          <w:rFonts w:ascii="Calibri" w:hAnsi="Calibri"/>
-          <w:b w:val="0"/>
-          <w:i/>
-          <w:color w:val="555B66"/>
-          <w:sz w:val="18"/>
-        </w:rPr>
-        <w:t>2022 – present</w:t>
-      </w:r>
-    </w:p>
-    <w:p>
-      <w:pPr>
-        <w:tabs>
-          <w:tab w:pos="245" w:val="left"/>
-        </w:tabs>
-        <w:spacing w:before="0" w:after="68" w:line="245" w:lineRule="auto"/>
-        <w:ind w:left="245" w:hanging="245"/>
-      </w:pPr>
-      <w:r>
-        <w:rPr>
-          <w:rFonts w:ascii="Calibri" w:hAnsi="Calibri"/>
-          <w:b/>
-          <w:color w:val="1B365D"/>
-          <w:sz w:val="20"/>
-        </w:rPr>
-        <w:t>•</w:t>
-        <w:tab/>
-      </w:r>
-      <w:r>
-        <w:rPr>
-          <w:rFonts w:ascii="Calibri" w:hAnsi="Calibri"/>
-          <w:b w:val="0"/>
-          <w:i w:val="0"/>
-          <w:color w:val="1A1A1A"/>
-          <w:sz w:val="20"/>
-        </w:rPr>
-        <w:t>Promoted through four ranks to Sergeant, responsible for the training and welfare of junior cadets on weekly parade nights.</w:t>
-      </w:r>
-    </w:p>
-    <w:p>
-      <w:pPr>
-        <w:tabs>
-          <w:tab w:pos="245" w:val="left"/>
-        </w:tabs>
-        <w:spacing w:before="0" w:after="68" w:line="245" w:lineRule="auto"/>
-        <w:ind w:left="245" w:hanging="245"/>
-      </w:pPr>
-      <w:r>
-        <w:rPr>
-          <w:rFonts w:ascii="Calibri" w:hAnsi="Calibri"/>
-          <w:b/>
-          <w:color w:val="1B365D"/>
-          <w:sz w:val="20"/>
-        </w:rPr>
-        <w:t>•</w:t>
-        <w:tab/>
-      </w:r>
-      <w:r>
-        <w:rPr>
-          <w:rFonts w:ascii="Calibri" w:hAnsi="Calibri"/>
-          <w:b w:val="0"/>
-          <w:i w:val="0"/>
-          <w:color w:val="1A1A1A"/>
-          <w:sz w:val="20"/>
-        </w:rPr>
-        <w:t>Methods of Instruction qualified, so I plan and deliver lessons to groups of 10–20 and assess cadets afterwards. Also hold the Silver Leadership award.</w:t>
-      </w:r>
-    </w:p>
-    <w:p>
-      <w:pPr>
-        <w:tabs>
-          <w:tab w:pos="245" w:val="left"/>
-        </w:tabs>
-        <w:spacing w:before="0" w:after="68" w:line="245" w:lineRule="auto"/>
-        <w:ind w:left="245" w:hanging="245"/>
-      </w:pPr>
-      <w:r>
-        <w:rPr>
-          <w:rFonts w:ascii="Calibri" w:hAnsi="Calibri"/>
-          <w:b/>
-          <w:color w:val="1B365D"/>
-          <w:sz w:val="20"/>
-        </w:rPr>
-        <w:t>•</w:t>
-        <w:tab/>
-      </w:r>
-      <w:r>
-        <w:rPr>
-          <w:rFonts w:ascii="Calibri" w:hAnsi="Calibri"/>
-          <w:b w:val="0"/>
-          <w:i w:val="0"/>
-          <w:color w:val="1A1A1A"/>
-          <w:sz w:val="20"/>
-        </w:rPr>
-        <w:t>Qualified First Aid Instructor (St John Ambulance), able to teach and assess first aid as well as respond to incidents.</w:t>
-      </w:r>
-    </w:p>
-    <w:p>
-      <w:pPr>
-        <w:tabs>
-          <w:tab w:pos="245" w:val="left"/>
-        </w:tabs>
-        <w:spacing w:before="0" w:after="68" w:line="245" w:lineRule="auto"/>
-        <w:ind w:left="245" w:hanging="245"/>
-      </w:pPr>
-      <w:r>
-        <w:rPr>
-          <w:rFonts w:ascii="Calibri" w:hAnsi="Calibri"/>
-          <w:b/>
-          <w:color w:val="1B365D"/>
-          <w:sz w:val="20"/>
-        </w:rPr>
-        <w:t>•</w:t>
-        <w:tab/>
-      </w:r>
-      <w:r>
-        <w:rPr>
-          <w:rFonts w:ascii="Calibri" w:hAnsi="Calibri"/>
-          <w:b w:val="0"/>
-          <w:i w:val="0"/>
-          <w:color w:val="1A1A1A"/>
-          <w:sz w:val="20"/>
-        </w:rPr>
-        <w:t>Represent the squadron at public events such as Remembrance Sunday, and competed in athletics at Wing and Regional level.</w:t>
-      </w:r>
-    </w:p>
-    <w:p>
-      <w:pPr>
-        <w:tabs>
-          <w:tab w:pos="10613" w:val="right"/>
-        </w:tabs>
-        <w:spacing w:before="140" w:after="50" w:line="240" w:lineRule="auto"/>
-        <w:keepNext/>
-      </w:pPr>
-      <w:r>
-        <w:rPr>
-          <w:rFonts w:ascii="Calibri" w:hAnsi="Calibri"/>
-          <w:b/>
-          <w:i w:val="0"/>
-          <w:color w:val="1B365D"/>
-          <w:sz w:val="21"/>
-        </w:rPr>
-        <w:t>Scouts and Explorers</w:t>
-      </w:r>
-      <w:r>
-        <w:rPr>
-          <w:rFonts w:ascii="Calibri" w:hAnsi="Calibri"/>
-          <w:b w:val="0"/>
-          <w:i w:val="0"/>
-          <w:color w:val="A0A8B4"/>
-          <w:sz w:val="20"/>
-        </w:rPr>
-        <w:t xml:space="preserve">  |  </w:t>
-      </w:r>
-      <w:r>
-        <w:rPr>
-          <w:rFonts w:ascii="Calibri" w:hAnsi="Calibri"/>
-          <w:b w:val="0"/>
-          <w:i w:val="0"/>
-          <w:color w:val="1A1A1A"/>
-          <w:sz w:val="20"/>
-        </w:rPr>
-        <w:t>Young Leader</w:t>
-      </w:r>
-      <w:r>
-        <w:tab/>
-      </w:r>
-      <w:r>
-        <w:rPr>
-          <w:rFonts w:ascii="Calibri" w:hAnsi="Calibri"/>
-          <w:b w:val="0"/>
-          <w:i/>
-          <w:color w:val="555B66"/>
-          <w:sz w:val="18"/>
-        </w:rPr>
-        <w:t>2014 – present</w:t>
-      </w:r>
-    </w:p>
-    <w:p>
-      <w:pPr>
-        <w:tabs>
-          <w:tab w:pos="245" w:val="left"/>
-        </w:tabs>
-        <w:spacing w:before="0" w:after="68" w:line="245" w:lineRule="auto"/>
-        <w:ind w:left="245" w:hanging="245"/>
-      </w:pPr>
-      <w:r>
-        <w:rPr>
-          <w:rFonts w:ascii="Calibri" w:hAnsi="Calibri"/>
-          <w:b/>
-          <w:color w:val="1B365D"/>
-          <w:sz w:val="20"/>
-        </w:rPr>
-        <w:t>•</w:t>
-        <w:tab/>
-      </w:r>
-      <w:r>
-        <w:rPr>
-          <w:rFonts w:ascii="Calibri" w:hAnsi="Calibri"/>
-          <w:b w:val="0"/>
-          <w:i w:val="0"/>
-          <w:color w:val="1A1A1A"/>
-          <w:sz w:val="20"/>
-        </w:rPr>
-        <w:t>Help run weekly meetings at my old Scout group, planning activities, keeping sessions on track and supporting the leaders.</w:t>
-      </w:r>
-    </w:p>
-    <w:p>
-      <w:pPr>
-        <w:tabs>
-          <w:tab w:pos="245" w:val="left"/>
-        </w:tabs>
-        <w:spacing w:before="0" w:after="68" w:line="245" w:lineRule="auto"/>
-        <w:ind w:left="245" w:hanging="245"/>
-      </w:pPr>
-      <w:r>
-        <w:rPr>
-          <w:rFonts w:ascii="Calibri" w:hAnsi="Calibri"/>
-          <w:b/>
-          <w:color w:val="1B365D"/>
-          <w:sz w:val="20"/>
-        </w:rPr>
-        <w:t>•</w:t>
-        <w:tab/>
-      </w:r>
-      <w:r>
-        <w:rPr>
-          <w:rFonts w:ascii="Calibri" w:hAnsi="Calibri"/>
-          <w:b w:val="0"/>
-          <w:i w:val="0"/>
-          <w:color w:val="1A1A1A"/>
-          <w:sz w:val="20"/>
-        </w:rPr>
-        <w:t>Help organise weekend camps and residentials: sorting equipment, giving safety briefings and running outdoor activities.</w:t>
-      </w:r>
-    </w:p>
-    <w:p>
-      <w:pPr>
-        <w:tabs>
-          <w:tab w:pos="245" w:val="left"/>
-        </w:tabs>
-        <w:spacing w:before="0" w:after="68" w:line="245" w:lineRule="auto"/>
-        <w:ind w:left="245" w:hanging="245"/>
-      </w:pPr>
-      <w:r>
-        <w:rPr>
-          <w:rFonts w:ascii="Calibri" w:hAnsi="Calibri"/>
-          <w:b/>
-          <w:color w:val="1B365D"/>
-          <w:sz w:val="20"/>
-        </w:rPr>
-        <w:t>•</w:t>
-        <w:tab/>
-      </w:r>
-      <w:r>
-        <w:rPr>
-          <w:rFonts w:ascii="Calibri" w:hAnsi="Calibri"/>
-          <w:b w:val="0"/>
-          <w:i w:val="0"/>
-          <w:color w:val="1A1A1A"/>
-          <w:sz w:val="20"/>
-        </w:rPr>
-        <w:t>Volunteer on the BBQ and bar at Balstock and the Baldock Beer Festival, serving 100+ members of the public, handling cash and keeping a busy food station clean and safe.</w:t>
-      </w:r>
-    </w:p>
-    <w:p>
-      <w:pPr>
-        <w:tabs>
-          <w:tab w:pos="10613" w:val="right"/>
-        </w:tabs>
-        <w:spacing w:before="140" w:after="50" w:line="240" w:lineRule="auto"/>
-        <w:keepNext/>
-      </w:pPr>
-      <w:r>
-        <w:rPr>
-          <w:rFonts w:ascii="Calibri" w:hAnsi="Calibri"/>
-          <w:b/>
-          <w:i w:val="0"/>
-          <w:color w:val="1B365D"/>
-          <w:sz w:val="21"/>
-        </w:rPr>
-        <w:t>Duke of Edinburgh’s Award</w:t>
-      </w:r>
-      <w:r>
-        <w:rPr>
-          <w:rFonts w:ascii="Calibri" w:hAnsi="Calibri"/>
-          <w:b w:val="0"/>
-          <w:i w:val="0"/>
-          <w:color w:val="A0A8B4"/>
-          <w:sz w:val="20"/>
-        </w:rPr>
-        <w:t xml:space="preserve">  |  </w:t>
-      </w:r>
-      <w:r>
-        <w:rPr>
-          <w:rFonts w:ascii="Calibri" w:hAnsi="Calibri"/>
-          <w:b w:val="0"/>
-          <w:i w:val="0"/>
-          <w:color w:val="1A1A1A"/>
-          <w:sz w:val="20"/>
-        </w:rPr>
-        <w:t>Bronze completed, Silver in progress</w:t>
-      </w:r>
-      <w:r>
-        <w:tab/>
-      </w:r>
-      <w:r>
-        <w:rPr>
-          <w:rFonts w:ascii="Calibri" w:hAnsi="Calibri"/>
-          <w:b w:val="0"/>
-          <w:i/>
-          <w:color w:val="555B66"/>
-          <w:sz w:val="18"/>
-        </w:rPr>
-        <w:t>2022 – present</w:t>
-      </w:r>
-    </w:p>
-    <w:p>
-      <w:pPr>
-        <w:tabs>
-          <w:tab w:pos="245" w:val="left"/>
-        </w:tabs>
-        <w:spacing w:before="0" w:after="68" w:line="245" w:lineRule="auto"/>
-        <w:ind w:left="245" w:hanging="245"/>
-      </w:pPr>
-      <w:r>
-        <w:rPr>
-          <w:rFonts w:ascii="Calibri" w:hAnsi="Calibri"/>
-          <w:b/>
-          <w:color w:val="1B365D"/>
-          <w:sz w:val="20"/>
-        </w:rPr>
-        <w:t>•</w:t>
-        <w:tab/>
-      </w:r>
-      <w:r>
-        <w:rPr>
-          <w:rFonts w:ascii="Calibri" w:hAnsi="Calibri"/>
-          <w:b w:val="0"/>
-          <w:i w:val="0"/>
-          <w:color w:val="1A1A1A"/>
-          <w:sz w:val="20"/>
-        </w:rPr>
-        <w:t>Expeditions in North Yorkshire and the Peak District involving route planning, navigation and teamwork, volunteering in the local community, and a cybersecurity club covering online safety and ethical hacking.</w:t>
-      </w:r>
-    </w:p>
-    <w:p>
-      <w:pPr>
-        <w:spacing w:before="220" w:after="90" w:line="240" w:lineRule="auto"/>
-        <w:pBdr>
-          <w:bottom w:val="single" w:sz="6" w:space="2" w:color="9BA6B8"/>
-        </w:pBdr>
-        <w:keepNext/>
-      </w:pPr>
-      <w:r>
-        <w:rPr>
-          <w:rFonts w:ascii="Calibri" w:hAnsi="Calibri"/>
-          <w:b/>
-          <w:i w:val="0"/>
-          <w:color w:val="1B365D"/>
-          <w:sz w:val="22"/>
-        </w:rPr>
         <w:t>QUALIFICATIONS, AWARDS &amp; INTERESTS</w:t>
       </w:r>
     </w:p>

</xml_diff>

<commit_message>
CV: tighter profile with target, merge home lab, cut repeated awards, stronger bullets
Co-Authored-By: Claude Sonnet 5.5 <noreply@anthropic.com>
</commit_message>
<xml_diff>
--- a/cv/James Dillon CV.docx
+++ b/cv/James Dillon CV.docx
@@ -319,7 +319,7 @@
           <w:color w:val="1A1A1A"/>
           <w:sz w:val="20"/>
         </w:rPr>
-        <w:t>I’m a Year 13 student studying Maths, Computer Science and Product Design, with a strong interest in software and engineering. I particularly enjoy combining software with hardware, which I’ve explored through projects including a smart home and an automated pet feeder, alongside experience at Janus Technology and MBDA. Aviation is also a big interest of mine, both as a hobby and through the RAF Air Cadets, where I’m now a Sergeant. I’m looking for a software or engineering apprenticeship where I can build on these interests while gaining practical experience in industry.</w:t>
+        <w:t>Year 13 student (Maths, Computer Science, Product Design) and part-time Junior Software Engineer who built and self-hosts a live UK traffic camera map. I enjoy combining software with hardware, from a smart home to an automated pet feeder, and I’m an RAF Air Cadets Sergeant. Seeking a software or engineering degree or higher apprenticeship starting September 2027.</w:t>
       </w:r>
     </w:p>
     <w:p>
@@ -814,7 +814,7 @@
           <w:color w:val="1A1A1A"/>
           <w:sz w:val="20"/>
         </w:rPr>
-        <w:t>grade 9 in Design and Technology and Computer Science; 8 in Physics and Media; 7 in Maths and Chemistry; 6 in Biology; 5 in English. Cambridge National in Enterprise and Marketing — M2 (grade A equivalent). Graded coursework is on my portfolio.</w:t>
+        <w:t>grade 9 in Design and Technology and Computer Science; 8 in Physics; 7 in Maths; 5 in English; plus 5 further GCSEs at grades 6–8 and a Cambridge National in Enterprise and Marketing (M2, grade A equivalent). Graded coursework is on my portfolio.</w:t>
       </w:r>
     </w:p>
     <w:p>
@@ -924,7 +924,7 @@
           <w:color w:val="1A1A1A"/>
           <w:sz w:val="20"/>
         </w:rPr>
-        <w:t>built a plugin for the open-source osTicket helpdesk that reads an incoming ticket, works out the likely problem and drafts a step-by-step reply, so common queries get a useful first response without waiting for an agent.</w:t>
+        <w:t>built a plugin for the open-source osTicket helpdesk that reads each incoming ticket, works out the likely problem and drafts a step-by-step reply, so common queries get a useful first response without waiting for an agent.</w:t>
       </w:r>
     </w:p>
     <w:p>
@@ -1031,7 +1031,7 @@
           <w:color w:val="1A1A1A"/>
           <w:sz w:val="20"/>
         </w:rPr>
-        <w:t>Worked to a brief on each project, mostly on my own but within a team, and iterated on feedback. Completed workplace fire warden training.</w:t>
+        <w:t>Deliver each project to a brief, mostly independently within a small team, revising it after code review and feedback from colleagues.</w:t>
       </w:r>
     </w:p>
     <w:p>
@@ -1122,7 +1122,7 @@
           <w:color w:val="1A1A1A"/>
           <w:sz w:val="20"/>
         </w:rPr>
-        <w:t xml:space="preserve">worked in a team to design and program a model guided missile running on a Raspberry Pi, helping with the code, integrating the hardware, testing the system and tracking down faults. Code on GitHub at </w:t>
+        <w:t xml:space="preserve">in a team, designed and built a model guided missile running on a Raspberry Pi. I wrote part of the control code, wired in the hardware, tested the system and tracked down faults. Code on GitHub at </w:t>
       </w:r>
       <w:hyperlink r:id="rId14">
         <w:r>
@@ -1271,7 +1271,7 @@
           <w:color w:val="1A1A1A"/>
           <w:sz w:val="20"/>
         </w:rPr>
-        <w:t>Promoted through four ranks to Sergeant, responsible for the training and welfare of junior cadets on weekly parade nights.</w:t>
+        <w:t>Promoted through four ranks to Sergeant; train and look after junior cadets every week on parade nights.</w:t>
       </w:r>
     </w:p>
     <w:p>
@@ -1300,7 +1300,7 @@
           <w:color w:val="1A1A1A"/>
           <w:sz w:val="20"/>
         </w:rPr>
-        <w:t>Methods of Instruction qualified, so I plan and deliver lessons to groups of 10–20 and assess cadets afterwards. Also hold the Silver Leadership award.</w:t>
+        <w:t>Methods of Instruction qualified: I plan and deliver lessons to groups of 10–20 and assess cadets afterwards. Hold the Silver Leadership award.</w:t>
       </w:r>
     </w:p>
     <w:p>
@@ -1439,7 +1439,7 @@
           <w:color w:val="1A1A1A"/>
           <w:sz w:val="20"/>
         </w:rPr>
-        <w:t>Help run weekly meetings at my old Scout group, planning activities, keeping sessions on track and supporting the leaders.</w:t>
+        <w:t>Plan and run activities at weekly meetings of my old Scout group, keeping sessions on track and supporting the leaders.</w:t>
       </w:r>
     </w:p>
     <w:p>
@@ -1468,7 +1468,7 @@
           <w:color w:val="1A1A1A"/>
           <w:sz w:val="20"/>
         </w:rPr>
-        <w:t>Help organise weekend camps and residentials: sorting equipment, giving safety briefings and running outdoor activities.</w:t>
+        <w:t>Organise kit, give safety briefings and run outdoor activities on weekend camps and residentials.</w:t>
       </w:r>
     </w:p>
     <w:p>
@@ -1866,7 +1866,7 @@
           <w:color w:val="1B365D"/>
           <w:sz w:val="21"/>
         </w:rPr>
-        <w:t>Home Assistant Smart Home</w:t>
+        <w:t>Home Lab — Home Assistant Smart Home &amp; Jellyfin</w:t>
       </w:r>
       <w:r>
         <w:rPr>
@@ -1992,58 +1992,6 @@
     <w:p>
       <w:pPr>
         <w:tabs>
-          <w:tab w:pos="10613" w:val="right"/>
-        </w:tabs>
-        <w:spacing w:before="140" w:after="50" w:line="240" w:lineRule="auto"/>
-        <w:keepNext/>
-      </w:pPr>
-      <w:r>
-        <w:rPr>
-          <w:rFonts w:ascii="Calibri" w:hAnsi="Calibri"/>
-          <w:b/>
-          <w:i w:val="0"/>
-          <w:color w:val="1B365D"/>
-          <w:sz w:val="21"/>
-        </w:rPr>
-        <w:t>Jellyfin Media Server</w:t>
-      </w:r>
-      <w:r>
-        <w:rPr>
-          <w:rFonts w:ascii="Calibri" w:hAnsi="Calibri"/>
-          <w:b w:val="0"/>
-          <w:i w:val="0"/>
-          <w:color w:val="A0A8B4"/>
-          <w:sz w:val="20"/>
-        </w:rPr>
-        <w:t xml:space="preserve">  |  </w:t>
-      </w:r>
-      <w:r>
-        <w:rPr>
-          <w:rFonts w:ascii="Calibri" w:hAnsi="Calibri"/>
-          <w:b w:val="0"/>
-          <w:i w:val="0"/>
-          <w:color w:val="1A1A1A"/>
-          <w:sz w:val="20"/>
-        </w:rPr>
-        <w:t>Self-hosted home lab</w:t>
-      </w:r>
-      <w:r>
-        <w:tab/>
-      </w:r>
-      <w:r>
-        <w:rPr>
-          <w:rFonts w:ascii="Calibri" w:hAnsi="Calibri"/>
-          <w:b w:val="0"/>
-          <w:i/>
-          <w:color w:val="555B66"/>
-          <w:sz w:val="18"/>
-        </w:rPr>
-        <w:t>2025 – present</w:t>
-      </w:r>
-    </w:p>
-    <w:p>
-      <w:pPr>
-        <w:tabs>
           <w:tab w:pos="245" w:val="left"/>
         </w:tabs>
         <w:spacing w:before="0" w:after="68" w:line="245" w:lineRule="auto"/>
@@ -2067,7 +2015,7 @@
           <w:color w:val="1A1A1A"/>
           <w:sz w:val="20"/>
         </w:rPr>
-        <w:t>Run a Jellyfin server holding our media and the CDs I have ripped, so the family has one central library. Set up to be reliable and simple enough that everyone can use it without my help.</w:t>
+        <w:t>Also run a Jellyfin media server so the family has one central library, including the CDs I have ripped, simple enough for everyone to use without my help.</w:t>
       </w:r>
     </w:p>
     <w:p>
@@ -2086,7 +2034,7 @@
           <w:color w:val="1B365D"/>
           <w:sz w:val="22"/>
         </w:rPr>
-        <w:t>QUALIFICATIONS, AWARDS &amp; INTERESTS</w:t>
+        <w:t>QUALIFICATIONS &amp; INTERESTS</w:t>
       </w:r>
     </w:p>
     <w:p>
@@ -2118,39 +2066,7 @@
           <w:color w:val="1A1A1A"/>
           <w:sz w:val="20"/>
         </w:rPr>
-        <w:t>Instructor First Aid, St John Ambulance · Methods of Instruction · BTEC Level 2 in Teamwork and Personal Development (GCSE equivalent) · Air Cadets Silver Leadership · Fire Warden (valid to 2027)</w:t>
-      </w:r>
-    </w:p>
-    <w:p>
-      <w:pPr>
-        <w:tabs>
-          <w:tab w:pos="1872" w:val="left"/>
-        </w:tabs>
-        <w:spacing w:before="0" w:after="72" w:line="245" w:lineRule="auto"/>
-        <w:ind w:left="1872" w:hanging="1872"/>
-      </w:pPr>
-      <w:r>
-        <w:rPr>
-          <w:rFonts w:ascii="Calibri" w:hAnsi="Calibri"/>
-          <w:b/>
-          <w:i w:val="0"/>
-          <w:color w:val="1B365D"/>
-          <w:sz w:val="20"/>
-        </w:rPr>
-        <w:t>Awards</w:t>
-      </w:r>
-      <w:r>
-        <w:tab/>
-      </w:r>
-      <w:r>
-        <w:rPr>
-          <w:rFonts w:ascii="Calibri" w:hAnsi="Calibri"/>
-          <w:b w:val="0"/>
-          <w:i w:val="0"/>
-          <w:color w:val="1A1A1A"/>
-          <w:sz w:val="20"/>
-        </w:rPr>
-        <w:t>EPQ A* (50/52) · Gold medal, Wing-level athletics · GCSE grade 9 in Design and Technology and in Computer Science</w:t>
+        <w:t>Instructor First Aid (St John Ambulance) · Methods of Instruction · BTEC Level 2 Teamwork and Personal Development · Fire Warden</w:t>
       </w:r>
     </w:p>
     <w:p>
@@ -2182,7 +2098,7 @@
           <w:color w:val="1A1A1A"/>
           <w:sz w:val="20"/>
         </w:rPr>
-        <w:t>Running (5K PB 20:35), home lab and self-hosting, 3D printing and electronics projects</w:t>
+        <w:t>Running (5K PB 20:35, Wing-level athletics gold), home lab and self-hosting, 3D printing and electronics projects</w:t>
       </w:r>
     </w:p>
     <w:p>

</xml_diff>

<commit_message>
CV: add VEX Robotics Club, refocus profile on hardware/software and home lab
Co-Authored-By: Claude Sonnet 5.5 <noreply@anthropic.com>
</commit_message>
<xml_diff>
--- a/cv/James Dillon CV.docx
+++ b/cv/James Dillon CV.docx
@@ -319,7 +319,7 @@
           <w:color w:val="1A1A1A"/>
           <w:sz w:val="20"/>
         </w:rPr>
-        <w:t>Year 13 student (Maths, Computer Science, Product Design) and part-time Junior Software Engineer who built and self-hosts a live UK traffic camera map. I enjoy combining software with hardware, from a smart home to an automated pet feeder, and I’m an RAF Air Cadets Sergeant. Seeking a software or engineering degree or higher apprenticeship starting September 2027.</w:t>
+        <w:t>Year 13 student (Maths, Computer Science, Product Design) and part-time Junior Software Engineer with a real love of combining hardware and software, in my coursework and personal projects alike. I run a Docker-based home lab with a Zigbee smart home and a Jellyfin media server, built an automated pet feeder for my EPQ, and I’m an RAF Air Cadets Sergeant. Seeking a software or engineering degree or higher apprenticeship starting September 2027.</w:t>
       </w:r>
     </w:p>
     <w:p>
@@ -1516,6 +1516,116 @@
           <w:color w:val="1B365D"/>
           <w:sz w:val="21"/>
         </w:rPr>
+        <w:t>VEX Robotics Club</w:t>
+      </w:r>
+      <w:r>
+        <w:rPr>
+          <w:rFonts w:ascii="Calibri" w:hAnsi="Calibri"/>
+          <w:b w:val="0"/>
+          <w:i w:val="0"/>
+          <w:color w:val="A0A8B4"/>
+          <w:sz w:val="20"/>
+        </w:rPr>
+        <w:t xml:space="preserve">  |  </w:t>
+      </w:r>
+      <w:r>
+        <w:rPr>
+          <w:rFonts w:ascii="Calibri" w:hAnsi="Calibri"/>
+          <w:b w:val="0"/>
+          <w:i w:val="0"/>
+          <w:color w:val="1A1A1A"/>
+          <w:sz w:val="20"/>
+        </w:rPr>
+        <w:t>Team Member &amp; Mentor, Knights Templar School</w:t>
+      </w:r>
+      <w:r>
+        <w:tab/>
+      </w:r>
+      <w:r>
+        <w:rPr>
+          <w:rFonts w:ascii="Calibri" w:hAnsi="Calibri"/>
+          <w:b w:val="0"/>
+          <w:i/>
+          <w:color w:val="555B66"/>
+          <w:sz w:val="18"/>
+        </w:rPr>
+        <w:t>Sept 2026 – present</w:t>
+      </w:r>
+    </w:p>
+    <w:p>
+      <w:pPr>
+        <w:tabs>
+          <w:tab w:pos="245" w:val="left"/>
+        </w:tabs>
+        <w:spacing w:before="0" w:after="68" w:line="245" w:lineRule="auto"/>
+        <w:ind w:left="245" w:hanging="245"/>
+      </w:pPr>
+      <w:r>
+        <w:rPr>
+          <w:rFonts w:ascii="Calibri" w:hAnsi="Calibri"/>
+          <w:b/>
+          <w:color w:val="1B365D"/>
+          <w:sz w:val="20"/>
+        </w:rPr>
+        <w:t>•</w:t>
+        <w:tab/>
+      </w:r>
+      <w:r>
+        <w:rPr>
+          <w:rFonts w:ascii="Calibri" w:hAnsi="Calibri"/>
+          <w:b w:val="0"/>
+          <w:i w:val="0"/>
+          <w:color w:val="1A1A1A"/>
+          <w:sz w:val="20"/>
+        </w:rPr>
+        <w:t>Design and build robots for VEX competition tasks such as moving and stacking objects, competing against other school teams in head-to-head arena matches.</w:t>
+      </w:r>
+    </w:p>
+    <w:p>
+      <w:pPr>
+        <w:tabs>
+          <w:tab w:pos="245" w:val="left"/>
+        </w:tabs>
+        <w:spacing w:before="0" w:after="68" w:line="245" w:lineRule="auto"/>
+        <w:ind w:left="245" w:hanging="245"/>
+      </w:pPr>
+      <w:r>
+        <w:rPr>
+          <w:rFonts w:ascii="Calibri" w:hAnsi="Calibri"/>
+          <w:b/>
+          <w:color w:val="1B365D"/>
+          <w:sz w:val="20"/>
+        </w:rPr>
+        <w:t>•</w:t>
+        <w:tab/>
+      </w:r>
+      <w:r>
+        <w:rPr>
+          <w:rFonts w:ascii="Calibri" w:hAnsi="Calibri"/>
+          <w:b w:val="0"/>
+          <w:i w:val="0"/>
+          <w:color w:val="1A1A1A"/>
+          <w:sz w:val="20"/>
+        </w:rPr>
+        <w:t>In the main team I help design mechanisms and parts. I also mentor younger groups, teaching the basic ideas and concepts of robot design.</w:t>
+      </w:r>
+    </w:p>
+    <w:p>
+      <w:pPr>
+        <w:tabs>
+          <w:tab w:pos="10613" w:val="right"/>
+        </w:tabs>
+        <w:spacing w:before="140" w:after="50" w:line="240" w:lineRule="auto"/>
+        <w:keepNext/>
+      </w:pPr>
+      <w:r>
+        <w:rPr>
+          <w:rFonts w:ascii="Calibri" w:hAnsi="Calibri"/>
+          <w:b/>
+          <w:i w:val="0"/>
+          <w:color w:val="1B365D"/>
+          <w:sz w:val="21"/>
+        </w:rPr>
         <w:t>Duke of Edinburgh’s Award</w:t>
       </w:r>
       <w:r>

</xml_diff>

<commit_message>
CV: MBDA dated July 2026, keep aviation interest, describe home lab as Home Assistant with Zigbee devices and wall switches
Co-Authored-By: Claude Sonnet 5.5 <noreply@anthropic.com>
</commit_message>
<xml_diff>
--- a/cv/James Dillon CV.docx
+++ b/cv/James Dillon CV.docx
@@ -319,7 +319,7 @@
           <w:color w:val="1A1A1A"/>
           <w:sz w:val="20"/>
         </w:rPr>
-        <w:t>Year 13 student (Maths, Computer Science, Product Design) and part-time Junior Software Engineer with a real love of combining hardware and software, in my coursework and personal projects alike. I run a Docker-based home lab with a Zigbee smart home and a Jellyfin media server, built an automated pet feeder for my EPQ, and I’m an RAF Air Cadets Sergeant. Seeking a software or engineering degree or higher apprenticeship starting September 2027.</w:t>
+        <w:t>Year 13 student (Maths, Computer Science, Product Design) and part-time Junior Software Engineer with a real love of combining hardware and software, in my coursework and personal projects alike. I run a Docker-based home lab with a Home Assistant smart home (Zigbee devices and wall switches) and a Jellyfin media server, built an automated pet feeder for my EPQ, and I’m an RAF Air Cadets Sergeant with a keen interest in aviation. Seeking a software or engineering degree or higher apprenticeship starting September 2027.</w:t>
       </w:r>
     </w:p>
     <w:p>
@@ -1083,7 +1083,7 @@
           <w:color w:val="555B66"/>
           <w:sz w:val="18"/>
         </w:rPr>
-        <w:t>2026</w:t>
+        <w:t>July 2026</w:t>
       </w:r>
     </w:p>
     <w:p>
@@ -2208,7 +2208,7 @@
           <w:color w:val="1A1A1A"/>
           <w:sz w:val="20"/>
         </w:rPr>
-        <w:t>Running (5K PB 20:35, Wing-level athletics gold), home lab and self-hosting, 3D printing and electronics projects</w:t>
+        <w:t>Aviation, running (5K PB 20:35, Wing-level athletics gold), home lab and self-hosting, 3D printing and electronics projects</w:t>
       </w:r>
     </w:p>
     <w:p>

</xml_diff>